<commit_message>
Bug fix & Full Rebuild
</commit_message>
<xml_diff>
--- a/Files/06 - Yom Tov/04 - Shavuos/5785/Shavuos 5785.docx
+++ b/Files/06 - Yom Tov/04 - Shavuos/5785/Shavuos 5785.docx
@@ -218,7 +218,7 @@
         <w:rPr>
           <w:rFonts w:ascii="Times New Roman" w:hAnsi="Times New Roman" w:cs="Times New Roman"/>
         </w:rPr>
-        <w:t xml:space="preserve"> Moshe Wolfson, in a marvelous sefer called Festivals of Faith, which discusses</w:t>
+        <w:t xml:space="preserve"> Moshe Wolfson, in a marvelous sefer called Festivals of Faith, which discusses </w:t>
       </w:r>
       <w:r>
         <w:rPr>
@@ -1203,7 +1203,7 @@
         <w:rPr>
           <w:rFonts w:ascii="Times New Roman" w:hAnsi="Times New Roman" w:cs="Times New Roman"/>
         </w:rPr>
-        <w:t>down here in</w:t>
+        <w:t xml:space="preserve">down here in </w:t>
       </w:r>
       <w:r>
         <w:rPr>

</xml_diff>